<commit_message>
Portada con los cinco integrantes del grupo
Nombres tomados del archivo de entrega, ya en el orden alfabetico que exige
la pauta. Las iniciales del segundo apellido quedan por confirmar.
</commit_message>
<xml_diff>
--- a/Punto1_Seleccion_y_evaluacion_de_mercado.docx
+++ b/Punto1_Seleccion_y_evaluacion_de_mercado.docx
@@ -431,7 +431,7 @@
               <w:spacing w:before="0" w:after="0" w:line="276" w:lineRule="auto"/>
             </w:pPr>
             <w:r>
-              <w:t xml:space="preserve">Integrantes</w:t>
+              <w:t xml:space="preserve">Fecha</w:t>
             </w:r>
           </w:p>
         </w:tc>
@@ -455,7 +455,109 @@
                 <w:i/>
                 <w:color w:val="5F6368"/>
               </w:rPr>
-              <w:t xml:space="preserve">[completar: Apellido1InicialApellido2Nombre, por orden alfabético]</w:t>
+              <w:t xml:space="preserve">[completar]</w:t>
+            </w:r>
+          </w:p>
+        </w:tc>
+      </w:tr>
+    </w:tbl>
+    <w:p>
+      <w:pPr>
+        <w:spacing w:before="0" w:after="120" w:line="276" w:lineRule="auto"/>
+      </w:pPr>
+      <w:r>
+        <w:t xml:space="preserve"/>
+      </w:r>
+    </w:p>
+    <w:p>
+      <w:pPr>
+        <w:spacing w:before="0" w:after="240" w:line="276" w:lineRule="auto"/>
+      </w:pPr>
+      <w:r>
+        <w:t xml:space="preserve"/>
+      </w:r>
+    </w:p>
+    <w:p>
+      <w:pPr>
+        <w:spacing w:before="0" w:after="100" w:line="276" w:lineRule="auto"/>
+        <w:jc w:val="center"/>
+      </w:pPr>
+      <w:r>
+        <w:rPr>
+          <w:b/>
+        </w:rPr>
+        <w:t xml:space="preserve">Integrantes</w:t>
+      </w:r>
+    </w:p>
+    <w:tbl>
+      <w:tblPr>
+        <w:tblW w:w="9070" w:type="dxa"/>
+        <w:tblBorders>
+          <w:top w:val="single" w:sz="4" w:color="C6CEC6"/>
+          <w:left w:val="single" w:sz="4" w:color="C6CEC6"/>
+          <w:bottom w:val="single" w:sz="4" w:color="C6CEC6"/>
+          <w:right w:val="single" w:sz="4" w:color="C6CEC6"/>
+          <w:insideH w:val="single" w:sz="4" w:color="C6CEC6"/>
+          <w:insideV w:val="single" w:sz="4" w:color="C6CEC6"/>
+        </w:tblBorders>
+        <w:tblLayout w:type="fixed"/>
+      </w:tblPr>
+      <w:tblGrid>
+        <w:gridCol w:w="4535"/>
+        <w:gridCol w:w="4535"/>
+      </w:tblGrid>
+      <w:tr>
+        <w:trPr>
+          <w:tblHeader/>
+          <w:cantSplit/>
+        </w:trPr>
+        <w:tc>
+          <w:tcPr>
+            <w:tcW w:w="4535" w:type="dxa"/>
+            <w:shd w:val="clear" w:color="auto" w:fill="1B5E20"/>
+            <w:vAlign w:val="center"/>
+            <w:tcMar>
+              <w:top w:w="80" w:type="dxa"/>
+              <w:bottom w:w="80" w:type="dxa"/>
+              <w:left w:w="110" w:type="dxa"/>
+              <w:right w:w="110" w:type="dxa"/>
+            </w:tcMar>
+          </w:tcPr>
+          <w:p>
+            <w:pPr>
+              <w:spacing w:before="0" w:after="0" w:line="276" w:lineRule="auto"/>
+              <w:jc w:val="center"/>
+            </w:pPr>
+            <w:r>
+              <w:rPr>
+                <w:b/>
+              </w:rPr>
+              <w:t xml:space="preserve">Apellidos y nombre</w:t>
+            </w:r>
+          </w:p>
+        </w:tc>
+        <w:tc>
+          <w:tcPr>
+            <w:tcW w:w="4535" w:type="dxa"/>
+            <w:shd w:val="clear" w:color="auto" w:fill="1B5E20"/>
+            <w:vAlign w:val="center"/>
+            <w:tcMar>
+              <w:top w:w="80" w:type="dxa"/>
+              <w:bottom w:w="80" w:type="dxa"/>
+              <w:left w:w="110" w:type="dxa"/>
+              <w:right w:w="110" w:type="dxa"/>
+            </w:tcMar>
+          </w:tcPr>
+          <w:p>
+            <w:pPr>
+              <w:spacing w:before="0" w:after="0" w:line="276" w:lineRule="auto"/>
+              <w:jc w:val="center"/>
+            </w:pPr>
+            <w:r>
+              <w:rPr>
+                <w:b/>
+              </w:rPr>
+              <w:t xml:space="preserve">Formato de archivo</w:t>
             </w:r>
           </w:p>
         </w:tc>
@@ -466,47 +568,250 @@
         </w:trPr>
         <w:tc>
           <w:tcPr>
-            <w:tcW w:w="2500" w:type="dxa"/>
-            <w:shd w:val="clear" w:color="auto" w:fill="F3F6F3"/>
-            <w:vAlign w:val="center"/>
-            <w:tcMar>
-              <w:top w:w="80" w:type="dxa"/>
-              <w:bottom w:w="80" w:type="dxa"/>
-              <w:left w:w="110" w:type="dxa"/>
-              <w:right w:w="110" w:type="dxa"/>
-            </w:tcMar>
-          </w:tcPr>
-          <w:p>
-            <w:pPr>
-              <w:spacing w:before="0" w:after="0" w:line="276" w:lineRule="auto"/>
-            </w:pPr>
-            <w:r>
-              <w:t xml:space="preserve">Fecha</w:t>
-            </w:r>
-          </w:p>
-        </w:tc>
-        <w:tc>
-          <w:tcPr>
-            <w:tcW w:w="6570" w:type="dxa"/>
-            <w:shd w:val="clear" w:color="auto" w:fill="F3F6F3"/>
-            <w:vAlign w:val="center"/>
-            <w:tcMar>
-              <w:top w:w="80" w:type="dxa"/>
-              <w:bottom w:w="80" w:type="dxa"/>
-              <w:left w:w="110" w:type="dxa"/>
-              <w:right w:w="110" w:type="dxa"/>
-            </w:tcMar>
-          </w:tcPr>
-          <w:p>
-            <w:pPr>
-              <w:spacing w:before="0" w:after="0" w:line="276" w:lineRule="auto"/>
-            </w:pPr>
-            <w:r>
-              <w:rPr>
-                <w:i/>
-                <w:color w:val="5F6368"/>
-              </w:rPr>
-              <w:t xml:space="preserve">[completar]</w:t>
+            <w:tcW w:w="4535" w:type="dxa"/>
+            <w:vAlign w:val="center"/>
+            <w:tcMar>
+              <w:top w:w="80" w:type="dxa"/>
+              <w:bottom w:w="80" w:type="dxa"/>
+              <w:left w:w="110" w:type="dxa"/>
+              <w:right w:w="110" w:type="dxa"/>
+            </w:tcMar>
+          </w:tcPr>
+          <w:p>
+            <w:pPr>
+              <w:spacing w:before="0" w:after="0" w:line="276" w:lineRule="auto"/>
+            </w:pPr>
+            <w:r>
+              <w:t xml:space="preserve">Altamirano · Vicente</w:t>
+            </w:r>
+          </w:p>
+        </w:tc>
+        <w:tc>
+          <w:tcPr>
+            <w:tcW w:w="4535" w:type="dxa"/>
+            <w:vAlign w:val="center"/>
+            <w:tcMar>
+              <w:top w:w="80" w:type="dxa"/>
+              <w:bottom w:w="80" w:type="dxa"/>
+              <w:left w:w="110" w:type="dxa"/>
+              <w:right w:w="110" w:type="dxa"/>
+            </w:tcMar>
+          </w:tcPr>
+          <w:p>
+            <w:pPr>
+              <w:spacing w:before="0" w:after="0" w:line="276" w:lineRule="auto"/>
+              <w:jc w:val="center"/>
+            </w:pPr>
+            <w:r>
+              <w:rPr>
+                <w:rFonts w:ascii="Consolas" w:hAnsi="Consolas"/>
+                <w:sz w:val="18"/>
+              </w:rPr>
+              <w:t xml:space="preserve">AltamiranoAVicente</w:t>
+            </w:r>
+          </w:p>
+        </w:tc>
+      </w:tr>
+      <w:tr>
+        <w:trPr>
+          <w:cantSplit/>
+        </w:trPr>
+        <w:tc>
+          <w:tcPr>
+            <w:tcW w:w="4535" w:type="dxa"/>
+            <w:shd w:val="clear" w:color="auto" w:fill="F3F6F3"/>
+            <w:vAlign w:val="center"/>
+            <w:tcMar>
+              <w:top w:w="80" w:type="dxa"/>
+              <w:bottom w:w="80" w:type="dxa"/>
+              <w:left w:w="110" w:type="dxa"/>
+              <w:right w:w="110" w:type="dxa"/>
+            </w:tcMar>
+          </w:tcPr>
+          <w:p>
+            <w:pPr>
+              <w:spacing w:before="0" w:after="0" w:line="276" w:lineRule="auto"/>
+            </w:pPr>
+            <w:r>
+              <w:t xml:space="preserve">Barrientos · Ignacio</w:t>
+            </w:r>
+          </w:p>
+        </w:tc>
+        <w:tc>
+          <w:tcPr>
+            <w:tcW w:w="4535" w:type="dxa"/>
+            <w:shd w:val="clear" w:color="auto" w:fill="F3F6F3"/>
+            <w:vAlign w:val="center"/>
+            <w:tcMar>
+              <w:top w:w="80" w:type="dxa"/>
+              <w:bottom w:w="80" w:type="dxa"/>
+              <w:left w:w="110" w:type="dxa"/>
+              <w:right w:w="110" w:type="dxa"/>
+            </w:tcMar>
+          </w:tcPr>
+          <w:p>
+            <w:pPr>
+              <w:spacing w:before="0" w:after="0" w:line="276" w:lineRule="auto"/>
+              <w:jc w:val="center"/>
+            </w:pPr>
+            <w:r>
+              <w:rPr>
+                <w:rFonts w:ascii="Consolas" w:hAnsi="Consolas"/>
+                <w:sz w:val="18"/>
+              </w:rPr>
+              <w:t xml:space="preserve">BarrientosRIgnacio</w:t>
+            </w:r>
+          </w:p>
+        </w:tc>
+      </w:tr>
+      <w:tr>
+        <w:trPr>
+          <w:cantSplit/>
+        </w:trPr>
+        <w:tc>
+          <w:tcPr>
+            <w:tcW w:w="4535" w:type="dxa"/>
+            <w:vAlign w:val="center"/>
+            <w:tcMar>
+              <w:top w:w="80" w:type="dxa"/>
+              <w:bottom w:w="80" w:type="dxa"/>
+              <w:left w:w="110" w:type="dxa"/>
+              <w:right w:w="110" w:type="dxa"/>
+            </w:tcMar>
+          </w:tcPr>
+          <w:p>
+            <w:pPr>
+              <w:spacing w:before="0" w:after="0" w:line="276" w:lineRule="auto"/>
+            </w:pPr>
+            <w:r>
+              <w:t xml:space="preserve">Langenbach · César</w:t>
+            </w:r>
+          </w:p>
+        </w:tc>
+        <w:tc>
+          <w:tcPr>
+            <w:tcW w:w="4535" w:type="dxa"/>
+            <w:vAlign w:val="center"/>
+            <w:tcMar>
+              <w:top w:w="80" w:type="dxa"/>
+              <w:bottom w:w="80" w:type="dxa"/>
+              <w:left w:w="110" w:type="dxa"/>
+              <w:right w:w="110" w:type="dxa"/>
+            </w:tcMar>
+          </w:tcPr>
+          <w:p>
+            <w:pPr>
+              <w:spacing w:before="0" w:after="0" w:line="276" w:lineRule="auto"/>
+              <w:jc w:val="center"/>
+            </w:pPr>
+            <w:r>
+              <w:rPr>
+                <w:rFonts w:ascii="Consolas" w:hAnsi="Consolas"/>
+                <w:sz w:val="18"/>
+              </w:rPr>
+              <w:t xml:space="preserve">LangenbachRCesar</w:t>
+            </w:r>
+          </w:p>
+        </w:tc>
+      </w:tr>
+      <w:tr>
+        <w:trPr>
+          <w:cantSplit/>
+        </w:trPr>
+        <w:tc>
+          <w:tcPr>
+            <w:tcW w:w="4535" w:type="dxa"/>
+            <w:shd w:val="clear" w:color="auto" w:fill="F3F6F3"/>
+            <w:vAlign w:val="center"/>
+            <w:tcMar>
+              <w:top w:w="80" w:type="dxa"/>
+              <w:bottom w:w="80" w:type="dxa"/>
+              <w:left w:w="110" w:type="dxa"/>
+              <w:right w:w="110" w:type="dxa"/>
+            </w:tcMar>
+          </w:tcPr>
+          <w:p>
+            <w:pPr>
+              <w:spacing w:before="0" w:after="0" w:line="276" w:lineRule="auto"/>
+            </w:pPr>
+            <w:r>
+              <w:t xml:space="preserve">Parra · Matías</w:t>
+            </w:r>
+          </w:p>
+        </w:tc>
+        <w:tc>
+          <w:tcPr>
+            <w:tcW w:w="4535" w:type="dxa"/>
+            <w:shd w:val="clear" w:color="auto" w:fill="F3F6F3"/>
+            <w:vAlign w:val="center"/>
+            <w:tcMar>
+              <w:top w:w="80" w:type="dxa"/>
+              <w:bottom w:w="80" w:type="dxa"/>
+              <w:left w:w="110" w:type="dxa"/>
+              <w:right w:w="110" w:type="dxa"/>
+            </w:tcMar>
+          </w:tcPr>
+          <w:p>
+            <w:pPr>
+              <w:spacing w:before="0" w:after="0" w:line="276" w:lineRule="auto"/>
+              <w:jc w:val="center"/>
+            </w:pPr>
+            <w:r>
+              <w:rPr>
+                <w:rFonts w:ascii="Consolas" w:hAnsi="Consolas"/>
+                <w:sz w:val="18"/>
+              </w:rPr>
+              <w:t xml:space="preserve">ParraLMatias</w:t>
+            </w:r>
+          </w:p>
+        </w:tc>
+      </w:tr>
+      <w:tr>
+        <w:trPr>
+          <w:cantSplit/>
+        </w:trPr>
+        <w:tc>
+          <w:tcPr>
+            <w:tcW w:w="4535" w:type="dxa"/>
+            <w:vAlign w:val="center"/>
+            <w:tcMar>
+              <w:top w:w="80" w:type="dxa"/>
+              <w:bottom w:w="80" w:type="dxa"/>
+              <w:left w:w="110" w:type="dxa"/>
+              <w:right w:w="110" w:type="dxa"/>
+            </w:tcMar>
+          </w:tcPr>
+          <w:p>
+            <w:pPr>
+              <w:spacing w:before="0" w:after="0" w:line="276" w:lineRule="auto"/>
+            </w:pPr>
+            <w:r>
+              <w:t xml:space="preserve">Saldivia · Constanza</w:t>
+            </w:r>
+          </w:p>
+        </w:tc>
+        <w:tc>
+          <w:tcPr>
+            <w:tcW w:w="4535" w:type="dxa"/>
+            <w:vAlign w:val="center"/>
+            <w:tcMar>
+              <w:top w:w="80" w:type="dxa"/>
+              <w:bottom w:w="80" w:type="dxa"/>
+              <w:left w:w="110" w:type="dxa"/>
+              <w:right w:w="110" w:type="dxa"/>
+            </w:tcMar>
+          </w:tcPr>
+          <w:p>
+            <w:pPr>
+              <w:spacing w:before="0" w:after="0" w:line="276" w:lineRule="auto"/>
+              <w:jc w:val="center"/>
+            </w:pPr>
+            <w:r>
+              <w:rPr>
+                <w:rFonts w:ascii="Consolas" w:hAnsi="Consolas"/>
+                <w:sz w:val="18"/>
+              </w:rPr>
+              <w:t xml:space="preserve">SaldiviaVConstanza</w:t>
             </w:r>
           </w:p>
         </w:tc>
@@ -518,6 +823,25 @@
       </w:pPr>
       <w:r>
         <w:t xml:space="preserve"/>
+      </w:r>
+    </w:p>
+    <w:p>
+      <w:pPr>
+        <w:spacing w:before="0" w:after="200" w:line="276" w:lineRule="auto"/>
+        <w:jc w:val="left"/>
+      </w:pPr>
+      <w:r>
+        <w:rPr>
+          <w:b/>
+          <w:sz w:val="18"/>
+        </w:rPr>
+        <w:t xml:space="preserve"/>
+      </w:r>
+      <w:r>
+        <w:rPr>
+          <w:sz w:val="18"/>
+        </w:rPr>
+        <w:t xml:space="preserve">Integrantes del grupo, en orden alfabético según exige la pauta. Verificar las iniciales del segundo apellido.</w:t>
       </w:r>
     </w:p>
     <w:p>

</xml_diff>